<commit_message>
Document remote study repairs and AWS verification
Update the working report, presentation and speaker notes with separate v2 and remote-v3 evidence. Preserve the S005 walkthrough and initial receipt-test timeout, then record the corrected acknowledgement-based check and the deployed synthetic verification. Make report assets self-contained and publish only sanitized audits.
</commit_message>
<xml_diff>
--- a/docs/report-chapters-draft.docx
+++ b/docs/report-chapters-draft.docx
@@ -27,7 +27,7 @@
     </w:p>
     <w:p>
       <w:r>
-        <w:t>Revision date: 21 October 2026, after AWS deployment verification. The submitted InfoNet abstract proposes a generic industrial data-collection interface. The image-and-metadata workflow is the implemented prototype scope; partner-specific requirements remain unconfirmed. Human evaluation has not been conducted. Engineering evidence and its limitations are reported separately from the planned comparison.</w:t>
+        <w:t>Revision date: 26 October 2026, incorporating a separate remote-study instrument and dated engineering verification. The submitted InfoNet abstract proposes a generic industrial data-collection interface. The image-and-metadata workflow is the implemented prototype scope; partner-specific requirements remain unconfirmed. Human evaluation results are not supplied for this report. Engineering evidence and its limitations are reported separately from the planned comparison.</w:t>
       </w:r>
     </w:p>
     <w:p>
@@ -40,7 +40,7 @@
     </w:p>
     <w:p>
       <w:r>
-        <w:t>This project develops a guided browser interface for collecting images with structured metadata. The prototype supports session setup, import, validation, review, direct correction and ZIP export. Transactional browser storage, recoverable drafts and explicit persistence feedback address failures identified during audit. The frozen build was deployed through AWS Amplify and verified in desktop Chrome on macOS and an isolated Ubuntu EC2 runner. Each platform passed 82 browser-regression checks and 42 hosting checks; the runner also passed 47 Node tests. Downloaded archives were independently checked for byte and metadata consistency. A local engineering run committed and restored six images totalling approximately 6.49 MB. Its deliberately allowed but incorrect value produced 24/24 complete and 23/24 correct metadata cells; direct correction preserved record and image identity. These synthetic results distinguish implementation correctness from factual accuracy. A controlled six-task comparison with a folder-and-spreadsheet workflow has been prepared, but no human observations have been collected. The contribution is a bounded UI implementation and reproducible engineering evaluation. Hosting improves access to the verified build without adding a collection backend; effects on human accuracy, completion time and perceived usability remain unestablished.</w:t>
+        <w:t>This project develops a guided browser interface for collecting images with structured metadata. Session setup, import, validation, direct correction, transactional browser storage, recoverable drafts and ZIP export address failures identified during audit. The frozen desktop v2 build was deployed through AWS Amplify and verified in desktop Chrome on macOS and an isolated Ubuntu EC2 runner. Each platform passed 82 browser-regression checks and 42 hosting checks; the runner also passed 47 Node tests. Downloaded archives were independently checked for byte and metadata consistency. A folder-and-spreadsheet comparison was prepared for desktop v2. A separate remote v3 instrument compares the adapted guided workflow with a browser table and collects metadata through a private AWS backend. On 26 October, synthetic session S005 completed six records in each condition, both downloaded archives passed independent checks, and AWS confirmed submission. No image bytes were uploaded and both questionnaires were skipped. The walkthrough also identified a refresh-related task-reference defect. These results verify bounded software behaviour and do not supply human observations, SUS scores or interface-speed comparisons.</w:t>
       </w:r>
     </w:p>
     <w:p>
@@ -95,7 +95,7 @@
     </w:p>
     <w:p>
       <w:r>
-        <w:t>The proposed research question is: for a defined images-and-metadata task, how does a guided collection interface compare with a basic folder-and-spreadsheet workflow in metadata completeness, metadata accuracy, successful image association and export, and task completion time? A secondary question concerns perceived usability and the difficulties encountered during recovery from errors. The comparison is deliberately local. It is not a claim that this prototype outperforms established data-collection platforms.</w:t>
+        <w:t>The proposed research question is: for a defined images-and-metadata task, how does a guided collection interface compare with a basic folder-and-spreadsheet workflow in metadata completeness, metadata accuracy, successful image association and export, and task completion time? A secondary question concerns perceived usability and the difficulties encountered during recovery from errors. The desktop v2 comparison is deliberately local. Remote v3 adapts the question to a browser-table baseline, as stated separately in Section 3.5. Neither design claims that this prototype outperforms established data-collection platforms.</w:t>
       </w:r>
     </w:p>
     <w:p>
@@ -108,7 +108,7 @@
     </w:p>
     <w:p>
       <w:r>
-        <w:t>Open Data Kit (ODK) is a direct precedent, not a tool to dismiss as post-capture labelling software. Hartung and colleagues describe an extensible suite comprising Collect, Aggregate, Voice, and Build. Collect supports application logic and several data types, while Aggregate supports storage and transfer; the paper presents modularity and composition as central architectural decisions.[1] The prototype adopts a much smaller boundary: a browser interface and a locally generated export, without a server-side collection platform.</w:t>
+        <w:t>Open Data Kit (ODK) is a direct precedent, not a tool to dismiss as post-capture labelling software. Hartung and colleagues describe an extensible suite comprising Collect, Aggregate, Voice, and Build. Collect supports application logic and several data types, while Aggregate supports storage and transfer; the paper presents modularity and composition as central architectural decisions.[1] The frozen desktop v2 prototype adopts a much smaller boundary: a browser interface and a locally generated export, without a server-side collection platform. The separate remote v3 instrument adds a purpose-limited metadata collection service, described in Section 2.11; it is not an industrial deployment or a comparison against ODK.</w:t>
       </w:r>
     </w:p>
     <w:p>
@@ -159,7 +159,7 @@
     </w:p>
     <w:p>
       <w:r>
-        <w:t>The current scope includes a single browser session, operator and device descriptions, one image per record, manually supplied metadata, local persistence, and ZIP export containing a CSV and JSON manifest. It excludes server synchronisation, multi-user access control, long-running sensor acquisition, automatic location verification, model training, and production integration. Static HTTPS deployment on AWS Amplify is included, while the collection data remains in browser storage. Browser camera paths have synthetic engineering coverage; physical cameras, phones and field use remain unverified. The student reports that the hardware description was general and no specific device was assigned. Partner-specific integration requirements remain unconfirmed.</w:t>
+        <w:t>The frozen desktop v2 scope includes a single browser session, operator and device descriptions, one image per record, manually supplied metadata, local persistence, and ZIP export containing a CSV and JSON manifest. It excludes server synchronisation, multi-user access control, long-running sensor acquisition, automatic location verification, model training, and production integration. Its static HTTPS deployment on AWS Amplify keeps collection data in browser storage. The separate remote v3 instrument adds consent, condition allocation, timed practice and task blocks, questionnaires, and authenticated metadata checkpoints to private AWS storage. It uses prepared fictional images and uploads their selected hashes rather than image contents. It does not add field acquisition, collaborative collection or partner integration. Browser camera paths have synthetic engineering coverage; physical cameras, phones and field use remain unverified. The student reports that the hardware description was general and no specific device was assigned. Partner-specific integration requirements remain unconfirmed.</w:t>
       </w:r>
     </w:p>
     <w:p>
@@ -186,7 +186,7 @@
     </w:p>
     <w:p>
       <w:r>
-        <w:t>The methodology combines a scoped software prototype, automated functional tests, failure-path tests, independent inspection of exported files and a planned human comparison. The original repository baseline is commit 9b58d081b8cfda492442a392fd4f9c0b407aa753. The revised implementation is an uncommitted working tree whose source hashes are retained with the 21 October verification evidence. The baseline commit does not identify the repaired source by itself.</w:t>
+        <w:t>The methodology combines a scoped software prototype, automated functional tests, failure-path tests, independent inspection of exported files and a planned human comparison. The original repository baseline is commit 9b58d081b8cfda492442a392fd4f9c0b407aa753. The 21 October revised implementation is identified by source hashes retained with its verification evidence. The original baseline commit does not identify the repaired source by itself. A public repository baseline was subsequently recorded on 26 October at commit 07fb045 before the updates described here.</w:t>
       </w:r>
     </w:p>
     <w:p>
@@ -204,12 +204,12 @@
         <w:pStyle w:val="Heading2"/>
       </w:pPr>
       <w:r>
-        <w:t>2.2 Architecture and responsibilities</w:t>
+        <w:t>2.2 Frozen desktop v2 architecture and responsibilities</w:t>
       </w:r>
     </w:p>
     <w:p>
       <w:r>
-        <w:t>The application consists of static HTML, CSS and JavaScript modules. It can run from the local server used during development or from the verified AWS Amplify HTTPS deployment. Neither launch method adds a collection backend or automatic image upload. The browser controller handles navigation, file processing, draft state and feedback. A pure-logic module contains the schema, validation, record creation, update rules, CSV serialization, manifest generation and ZIP construction. A separate persistence module reads and writes a single state envelope in IndexedDB.</w:t>
+        <w:t>The desktop v2 application consists of static HTML, CSS and JavaScript modules. It can run from the local server used during development or from the verified AWS Amplify HTTPS deployment. Neither launch method adds a collection backend or automatic image upload. The browser controller handles navigation, file processing, draft state and feedback. A pure-logic module contains the schema, validation, record creation, update rules, CSV serialization, manifest generation and ZIP construction. A separate persistence module reads and writes a single state envelope in IndexedDB.</w:t>
       </w:r>
     </w:p>
     <w:p>
@@ -895,7 +895,7 @@
         <w:pStyle w:val="Heading2"/>
       </w:pPr>
       <w:r>
-        <w:t>2.9 AWS deployment and data boundaries</w:t>
+        <w:t>2.9 Desktop v2 AWS deployment and data boundaries</w:t>
       </w:r>
     </w:p>
     <w:p>
@@ -954,6 +954,40 @@
     </w:p>
     <w:p>
       <w:pPr>
+        <w:pStyle w:val="Heading2"/>
+      </w:pPr>
+      <w:r>
+        <w:t>2.11 Separate remote v3 architecture and data boundaries</w:t>
+      </w:r>
+    </w:p>
+    <w:p>
+      <w:r>
+        <w:t xml:space="preserve">HLL04-remote-table-v3 is a separate study instrument at </w:t>
+      </w:r>
+      <w:hyperlink r:id="rId12">
+        <w:r>
+          <w:rPr>
+            <w:color w:val="0563C1"/>
+          </w:rPr>
+          <w:t>the remote study address</w:t>
+        </w:r>
+      </w:hyperlink>
+      <w:r>
+        <w:t>. Its wrapper adapts the guided implementation, provides a plain browser-table condition, isolates condition storage, and adds practice, timing, export checks and questionnaires. The original desktop v2 build and instruments remain a distinct historical version. Remote v3 uses supplied fictional illustrations; images must be explicitly selected in both conditions. It neither captures new photographs nor assigns a correct image automatically from a task ID.</w:t>
+      </w:r>
+    </w:p>
+    <w:p>
+      <w:r>
+        <w:t>Amplify serves the static study assets. A dedicated Lambda collection API exchanges an invitation for a private session credential and accepts authenticated, sequenced checkpoints. Accepted snapshots are stored in a private encrypted S3 bucket, with DynamoDB receipts and the latest accepted pointer. Client requests are serialized and retried with their original sequence and idempotency identity. A visible submission receipt requires a server acknowledgement; a local save or generated ZIP is a different state. There is no EC2 application server in this collection path.</w:t>
+      </w:r>
+    </w:p>
+    <w:p>
+      <w:r>
+        <w:t>The study payload includes raw task metadata, reported selected-image hashes, protocol/build identity, progress, client timing/events and optional questionnaire responses. Image bytes and invitation/session credentials are excluded from research exports. Reported image hashes are not independent verification of uploaded bytes. Human P-codes and synthetic S-codes use separate allocation; synthetic sessions are excluded from participant analysis. The nominal retention period is 90 days, with asynchronous AWS expiry and separately managed researcher copies. A private credential supports withdrawal; pending cleanup must be distinguished from completed deletion. These controls do not establish ethics approval, authenticated personal identity or security certification.</w:t>
+      </w:r>
+    </w:p>
+    <w:p>
+      <w:pPr>
         <w:pStyle w:val="Heading1"/>
         <w:pageBreakBefore/>
       </w:pPr>
@@ -966,7 +1000,7 @@
         <w:pStyle w:val="Heading2"/>
       </w:pPr>
       <w:r>
-        <w:t>3.1 Design and experimental boundary</w:t>
+        <w:t>3.1 Frozen desktop v2 design and experimental boundary</w:t>
       </w:r>
     </w:p>
     <w:p>
@@ -1060,12 +1094,30 @@
     </w:p>
     <w:p>
       <w:r>
-        <w:t>Brooke’s SUS uses ten responses on a five-position scale. Odd-numbered items contribute the response minus one, even-numbered items contribute five minus the response, and the sum is multiplied by 2.5 to obtain a value from zero to one hundred.[4] The result is a composite usability score, not a percentage of correct tasks. No adjective benchmark is applied. The repaired parser requires exactly ten integer ratings from one to five and finite, nonnegative times. No questionnaire was answered by an AI agent, and no human SUS result is reported.</w:t>
+        <w:t>Brooke’s SUS uses ten responses on a five-position scale. Odd-numbered items contribute the response minus one, even-numbered items contribute five minus the response, and the sum is multiplied by 2.5 to obtain a value from zero to one hundred.[4] The result is a composite usability score, not a percentage of correct tasks. No adjective benchmark is applied. The repaired parser requires exactly ten integer ratings from one to five and finite, nonnegative times. The parser fixtures are synthetic and do not supply participant questionnaire responses; no human SUS result is reported.</w:t>
       </w:r>
     </w:p>
     <w:p>
       <w:r>
         <w:t>The timing utility computes an even-sample median from the two middle values. It rejects duplicate participant-condition rows, lists missing pairs and separates all-row descriptive summaries from complete-pair differences. Regression fixtures reject incomplete or invalid questionnaire inputs; they are not participant observations. Only completed blocks with complete questionnaires enter the combined timing/SUS table. Partial attempts and available times remain in the collection log and must be reported separately. The utility does not perform outcome-specific missing-value analysis. Automation durations are never entered as participant completion times.</w:t>
+      </w:r>
+    </w:p>
+    <w:p>
+      <w:pPr>
+        <w:pStyle w:val="Heading2"/>
+      </w:pPr>
+      <w:r>
+        <w:t>3.5 Remote v3 protocol and interpretation boundary</w:t>
+      </w:r>
+    </w:p>
+    <w:p>
+      <w:r>
+        <w:t>The remote protocol uses a plain in-browser table as its baseline. The original external folder-and-spreadsheet condition belongs to desktop v2. The exploratory target is six to eight permitted adult volunteers, without a power or official-minimum claim. Each person uses one desktop/laptop and browser for both conditions, while computers may differ between people. The same six cards, four required labels and explicit image choices are supplied to both conditions. Separate two-minute practices precede fresh measured blocks capped at fifteen minutes. Assigned order alternates, while reloads and interruptions remain recorded and timing does not silently pause.</w:t>
+      </w:r>
+    </w:p>
+    <w:p>
+      <w:r>
+        <w:t>Remote timing includes entry, review, correction, export generation and participant file checks; upload latency and questionnaire time are separate. Generated artifacts, requested downloads and participant-reported file opening are distinct observations. This endpoint differs from the researcher-verified desktop v2 endpoint. Completeness and accuracy retain all 24 required cells per condition, and selected-image hash agreement is reported out of six. Quality, completed timing and valid SUS each have separate eligibility and paired sample counts. Skipped questionnaires are missing, never zero. Synthetic tests and withdrawn sessions cannot enter human results, and no human observations are supplied as results in this report.</w:t>
       </w:r>
     </w:p>
     <w:p>
@@ -3717,7 +3769,7 @@
                     <pic:cNvPicPr/>
                   </pic:nvPicPr>
                   <pic:blipFill>
-                    <a:blip r:embed="rId12"/>
+                    <a:blip r:embed="rId13"/>
                     <a:stretch>
                       <a:fillRect/>
                     </a:stretch>
@@ -3791,7 +3843,7 @@
                     <pic:cNvPicPr/>
                   </pic:nvPicPr>
                   <pic:blipFill>
-                    <a:blip r:embed="rId13"/>
+                    <a:blip r:embed="rId14"/>
                     <a:stretch>
                       <a:fillRect/>
                     </a:stretch>
@@ -4728,6 +4780,62 @@
     </w:p>
     <w:p>
       <w:pPr>
+        <w:pStyle w:val="Heading2"/>
+      </w:pPr>
+      <w:r>
+        <w:t>4.15 Agent-run remote v3 walkthrough on 26 October</w:t>
+      </w:r>
+    </w:p>
+    <w:p>
+      <w:r>
+        <w:t>The supplied test report records a complete desktop Google Chrome workflow on macOS. Synthetic session S005 used Table then Guided and completed six records in each measured condition. Both actual ZIP downloads were opened independently: each contained six correct task metadata sets and six matching prepared images, with CRC, safe unique paths, image hashes and CSV/manifest agreement checked. Editing a location after export cleared the file confirmations and marked the artifact stale; restoring the value and exporting again allowed completion. Required-field feedback, expired-practice controls, normal finish gates and questionnaire validation were exercised. Both questionnaires were skipped with labelled agent-test comments; no SUS score was produced.</w:t>
+      </w:r>
+    </w:p>
+    <w:p>
+      <w:r>
+        <w:t>The interface displayed a server receipt at 15:35:13 HKT. Independent AWS readback confirmed accepted sequence 43, the synthetic marker, both six-task completed conditions, skipped questionnaires, matching selected-image hashes and no image bytes in the submission payload. This proves receipt of that synthetic response, not participant identity, human usability or factual scene interpretation. The source report recorded Amplify job 4 as succeeded, the study stack as UPDATE_COMPLETE and Lambda as active with a successful last update. These are dated observations of that build.</w:t>
+      </w:r>
+    </w:p>
+    <w:p>
+      <w:r>
+        <w:t>A separate synthetic S004 session retained six guided records and an incomplete-finish checkpoint on AWS, without final submission or a started table condition. Refresh preserved saved work, a partially entered guided draft and table rows/images, while the block timer continued. Duplicate-tab restrictions were also observed. However, the outer task reference reset to task 1 after refresh, despite restored work belonging to another task. This was a confirmed context-restoration defect. The guided page also required navigation among separate scrolling areas; its effect on human effort is unmeasured.</w:t>
+      </w:r>
+    </w:p>
+    <w:p>
+      <w:r>
+        <w:t>The public study module at that time lacked a local checkpoint coalescing safeguard. Its existing queue serialized requests, so that difference did not establish overlapping writes or lost data. Slow-network submission and withdrawal were untested. An in-app browser failed to expose an export download and later its control timed out, while normal desktop Chrome completed both downloads and submission. The cause of that control timeout was not established. Receipt recovery in another browser, withdrawal/deletion, offline recovery, fully answered numeric SUS, mobile use, accessibility and hostile-input security were outside this walkthrough. Agent execution durations include inspection and interruptions and cannot compare interface speed. The dated report and sanitized AWS/ZIP verification summaries are preserved in docs/aws-agent-test-2026-10-26; the evidence index is docs/verification-2026-10-26.md.</w:t>
+      </w:r>
+    </w:p>
+    <w:p>
+      <w:pPr>
+        <w:pStyle w:val="Heading2"/>
+      </w:pPr>
+      <w:r>
+        <w:t>4.16 Remote v3 implementation follow-up on 26 October</w:t>
+      </w:r>
+    </w:p>
+    <w:p>
+      <w:r>
+        <w:t>The subsequent frontend repair restores the task reference, selected row/image context and recoverable work after refresh while retaining the active timer. It also coalesces redundant checkpoints while preserving serialized, exact idempotent retries. Tests cover local edits made while an acknowledgement is lost and adoption of newer accepted remote state. Receipt-restoration failure now prevents an empty replacement attempt. Withdrawal acknowledgement uses the same local cleanup path after a direct action, retry or reload; expired collection access retains the withdrawal route and blocked browser-database cleanup is surfaced. These additional lifecycle cases were investigated during the follow-up and were not findings claimed by the original walkthrough.</w:t>
+      </w:r>
+    </w:p>
+    <w:p>
+      <w:r>
+        <w:t>The selected local checks passed: 10 frontend core tests, 10 focused recovery checks, 45 existing remote browser checks, two slow-network cases and 18 full six-record paired-flow checks. Independent review reran the core, recovery and slow-network checks and reviewed the other execution evidence. These are overlapping engineering predicates, not users or independent experiments. The frozen desktop app, backend, styles and protocol were retained. Separate guided scrolling areas remain deferred for protocol and fidelity review, and the in-app-browser timeout cause remains unestablished. Detailed checks and deployment evidence are indexed in docs/verification-2026-10-26.md.</w:t>
+      </w:r>
+    </w:p>
+    <w:p>
+      <w:r>
+        <w:t>Amplify job 5 succeeded at 16:05:05 HKT on 26 October. All 21 served files independently matched the release manifest for source commit 7eb8312a76e574b982abb91afa496909584f3c34. The hosted six-record suite passed 18 checks in synthetic S006; both downloaded ZIPs passed independent byte, path, CRC and CSV/manifest audits. Direct DynamoDB and S3 readback confirmed accepted sequence 5, six exact records and matching selected-image hashes in each condition, and no image bytes or credentials in the payload. S006 supplied ten numeric questionnaire fixtures per condition to exercise the instrument. Those values are not human ratings, supply no usability result and remain excluded from participant analysis; they are separate from S005's skipped questionnaires.</w:t>
+      </w:r>
+    </w:p>
+    <w:p>
+      <w:r>
+        <w:t>Two hosted slow-network cases passed. The initial hosted recovery run passed nine of ten scenarios; its cross-browser receipt case timed out because the test accepted an earlier checkpoint as ready. A diagnostic confirmed that receipt restore correctly returned the acknowledged snapshot. Requiring acknowledgement of the actual edited row then produced a passing focused rerun in a fresh browser, without changing the deployed product. The original 9/10 and separate 1/1 results are retained; a full ten-scenario rerun is not claimed. These checks combine actual Lambda requests and browser storage with controlled response faults. They do not establish actual four-hour or ninety-day expiry, or AWS lease-delayed deletion.</w:t>
+      </w:r>
+    </w:p>
+    <w:p>
+      <w:pPr>
         <w:pStyle w:val="Heading1"/>
         <w:pageBreakBefore/>
       </w:pPr>
@@ -4768,7 +4876,7 @@
     </w:p>
     <w:p>
       <w:r>
-        <w:t>The browser application runs from localhost or Amplify without a collection server and keeps the collected records on the operator's device until export. It also transfers responsibility for retention to the browser and the operator. Transactional storage can prevent partial updates within the tested state envelope, but it is not a remote backup. Clearing site data, losing the computer or using a different origin can make a session unavailable. A downloaded recovery archive is therefore a separate protection, and its success must be checked independently of the browser's save status.</w:t>
+        <w:t>The desktop v2 application runs from localhost or Amplify without a collection server and keeps the collected records on the operator's device until export. It also transfers responsibility for retention to the browser and the operator. Transactional storage can prevent partial updates within the tested state envelope, but it is not a remote backup. Clearing site data, losing the computer or using a different origin can make a session unavailable. A downloaded recovery archive is therefore a separate protection, and its success must be checked independently of the browser's save status.</w:t>
       </w:r>
     </w:p>
     <w:p>
@@ -4837,7 +4945,7 @@
     </w:p>
     <w:p>
       <w:r>
-        <w:t>Engineering extensions should follow evidence. Physical camera operation, browser coverage, screen-reader use, larger workloads and recovery onto a different computer remain separate tests. Partner feedback could change the application and the measures substantially. A server, authentication or sensor integration should be added only if the actual requirements justify that scope; adding such components merely to appear more complex would make the prototype harder to evaluate before the presentation.</w:t>
+        <w:t>Engineering extensions should follow evidence. Physical camera operation, browser coverage, screen-reader use, larger workloads and recovery onto a different computer remain separate tests. Partner feedback could change the application and the measures substantially. The v3 metadata service addresses remote study collection rather than industrial integration. Further authentication, collaborative collection or sensor integration should follow confirmed requirements and a separately verified design.</w:t>
       </w:r>
     </w:p>
     <w:p>
@@ -4860,12 +4968,30 @@
     </w:p>
     <w:p>
       <w:r>
-        <w:t>Hosting also introduces operational trade-offs. An internet connection is needed for an uncached start, and a public address does not provide user authentication or shared records. Each browser origin retains its own data, so moving between local and hosted versions can confuse recovery unless the environment is fixed and exports are retained. Adding central storage would require a new design for identity, access, retention, synchronisation and failure handling. It should follow confirmed requirements rather than being assumed to exist because the page is hosted.</w:t>
+        <w:t>Hosting also introduces operational trade-offs. Desktop v2 needs an internet connection for an uncached start; its public address does not provide user authentication or shared records. Each browser origin retains its own data, so moving between local and hosted versions can confuse recovery unless the environment is fixed and exports are retained. Remote v3 adds a separate authenticated metadata service with explicit identity, retention and failure boundaries. Its existence follows from that collection design, not from static hosting alone, and does not make images available across devices.</w:t>
       </w:r>
     </w:p>
     <w:p>
       <w:r>
         <w:t>The recorded 21 October 2026 On-Demand compute rate for the Linux, shared-tenancy t3.medium runner in us-east-1 was US$0.0416 per running hour. After it was stopped, the retained 20 GiB gp3 disk remained billable at a recorded rate of US$0.08 per GB-month, approximately US$1.60 for a full month before credits or taxes. Amplify hosting usage, S3, public IPv4 usage while allocated and any applicable network charges are separate. These are dated configuration and pricing observations, not the project's final bill or a claim of free operation. Limiting the runner to verification makes its role and ongoing storage cost explicit.</w:t>
+      </w:r>
+    </w:p>
+    <w:p>
+      <w:pPr>
+        <w:pStyle w:val="Heading2"/>
+      </w:pPr>
+      <w:r>
+        <w:t>5.7 Interpretation of remote v3 engineering evidence</w:t>
+      </w:r>
+    </w:p>
+    <w:p>
+      <w:r>
+        <w:t>The 26 October run extends the engineering evidence from local persistence and exports to an end-to-end remote study flow and acknowledged metadata submission. It also found a context-restoration problem that successful record recovery alone did not reveal. Retaining data and helping a person understand the restored task are distinct requirements. Any layout or interaction repair must remain traceable to a build and protocol revision so that later observations are not pooled across an undocumented change.</w:t>
+      </w:r>
+    </w:p>
+    <w:p>
+      <w:r>
+        <w:t>The browser-table baseline, unmoderated setting, participant device variation and self-reported file checks change the comparison. They do not retrospectively validate or complete the desktop v2 protocol. Client timestamps and selected-image hashes have narrower evidential meaning than independent observation and downloaded-byte checks. The available S005 evidence verifies a synthetic workflow; it supplies no human time difference, SUS rating or claim that the guided interface is easier to use.</w:t>
       </w:r>
     </w:p>
     <w:p>
@@ -4889,12 +5015,12 @@
     </w:p>
     <w:p>
       <w:r>
-        <w:t>The unchanged frozen build is now accessible through an Amplify HTTPS address. It passed the same 82-check browser regression and the final 42-check hosting suite in both Mac and Linux Chrome, with 47 Node tests passing on the isolated EC2 runner. Downloaded files and source hashes were checked independently, and the initial Linux camera-test failure was retained with its corrected precondition. This adds reproducible deployment evidence while leaving physical-device behaviour and human benefit as separate questions.</w:t>
+        <w:t>The unchanged frozen desktop v2 build is accessible through its Amplify HTTPS address. It passed the same 82-check browser regression and the final 42-check hosting suite in both Mac and Linux Chrome, with 47 Node tests passing on the isolated EC2 runner. Downloaded files and source hashes were checked independently, and the initial Linux camera-test failure was retained with its corrected precondition. This adds reproducible deployment evidence while leaving physical-device behaviour and human benefit as separate questions.</w:t>
       </w:r>
     </w:p>
     <w:p>
       <w:r>
-        <w:t>The remaining academic task is to connect the implemented workflow to observed use under a fair protocol and to confirm the intended industrial context. The final account should retain unsuccessful tasks and limitations, disclose AI assistance accurately, and state which design choices the student can explain and defend. These boundaries make the engineering contribution assessable while keeping uncollected results outside the conclusions.</w:t>
+        <w:t>A separate remote v3 instrument adds a browser-table baseline and private metadata collection. Its 26 October synthetic Chrome run completed both six-record blocks, independently verified both downloaded packages and received a server-confirmed submission; both questionnaires were skipped. The subsequent repair was published as Amplify job 5 and checked through real hosted requests, downloaded archives and scoped recovery/fault cases. This demonstrates the tested engineering path and leaves human outcomes unavailable for this report. The remaining academic task is to connect the implemented workflow to observed use under a fair, versioned protocol and to confirm the intended industrial context. The final account should retain unsuccessful tasks and limitations, disclose AI assistance accurately, and state which design choices the student can explain and defend. These boundaries make the engineering contribution assessable while keeping uncollected results outside the conclusions.</w:t>
       </w:r>
     </w:p>
     <w:p>
@@ -4910,7 +5036,7 @@
         <w:spacing w:line="276" w:lineRule="auto"/>
       </w:pPr>
       <w:r>
-        <w:t>AI tools assisted source review, prototype implementation and repair, AWS provisioning, automated testing, synthetic fixtures, engineering analysis, report drafting and presentation preparation. The October 2026 work includes Codex assistance and reviews requested through a local gateway using the model identifier claude-opus-5-5. Earlier saved material also records Hermes assistance; the exact model used in every historical step has not been independently established. These tools did not act as human participants or supply human SUS ratings, interviews, completion times, partner approval or consent. The earlier 21 October repair changed application and evaluation code. The subsequent AWS deployment retained those frozen files, added hosting configuration and separate test tools, and updated the report and presentation using saved execution evidence. The student must review the recorded commands and results rather than representing them as personally executed manual tests.</w:t>
+        <w:t>AI tools assisted source review, prototype implementation and repair, AWS provisioning, automated testing, synthetic fixtures, engineering analysis, report drafting and presentation preparation. The October 2026 work includes Codex assistance and reviews requested through a local gateway using the model identifier claude-opus-5-5. Earlier saved material also records Hermes assistance; the exact model used in every historical step has not been independently established. These tools did not act as human participants or supply human SUS ratings, interviews, completion times, partner approval or consent. The earlier 21 October repair changed application and evaluation code. The subsequent AWS deployment retained those frozen files, added hosting configuration and separate test tools, and updated the report and presentation using saved execution evidence. The 26 October update also incorporates a supplied agent-run remote-study walkthrough, synthetic AWS readback and subsequent implementation verification. No agent execution duration or skipped questionnaire is treated as a human result. The student must review the recorded commands and results rather than representing them as personally executed manual tests.</w:t>
       </w:r>
     </w:p>
     <w:p>
@@ -4937,7 +5063,7 @@
       <w:r>
         <w:t xml:space="preserve">[1] C. Hartung, Y. Anokwa, W. Brunette, A. Lerer, C. Tseng and G. Borriello, Open Data Kit: Tools to Build Information Services for Developing Regions, ICTD, 2010. </w:t>
       </w:r>
-      <w:hyperlink r:id="rId14">
+      <w:hyperlink r:id="rId15">
         <w:r>
           <w:rPr>
             <w:color w:val="0563C1"/>
@@ -4955,7 +5081,7 @@
       <w:r>
         <w:t xml:space="preserve">[2] ODK, Form Logic, official documentation (accessed 16 October 2026). </w:t>
       </w:r>
-      <w:hyperlink r:id="rId15">
+      <w:hyperlink r:id="rId16">
         <w:r>
           <w:rPr>
             <w:color w:val="0563C1"/>
@@ -4973,7 +5099,7 @@
       <w:r>
         <w:t xml:space="preserve">[3] J. A. Bargas-Avila, O. Brenzikofer, S. P. Roth, A. N. Tuch, S. Orsini and K. Opwis, Simple but Crucial User Interfaces in the World Wide Web: Introducing 20 Guidelines for Usable Web Form Design, in User Interfaces, 2010, doi:10.5772/9500. </w:t>
       </w:r>
-      <w:hyperlink r:id="rId16">
+      <w:hyperlink r:id="rId17">
         <w:r>
           <w:rPr>
             <w:color w:val="0563C1"/>
@@ -4991,7 +5117,7 @@
       <w:r>
         <w:t xml:space="preserve">[4] J. Brooke, SUS: A quick and dirty usability scale, chapter reproduction hosted by AHRQ. </w:t>
       </w:r>
-      <w:hyperlink r:id="rId17">
+      <w:hyperlink r:id="rId18">
         <w:r>
           <w:rPr>
             <w:color w:val="0563C1"/>
@@ -5009,7 +5135,7 @@
       <w:r>
         <w:t xml:space="preserve">[5] Amazon Web Services, Welcome to AWS Amplify Hosting, AWS Amplify Hosting User Guide (accessed 21 October 2026). </w:t>
       </w:r>
-      <w:hyperlink r:id="rId18">
+      <w:hyperlink r:id="rId19">
         <w:r>
           <w:rPr>
             <w:color w:val="0563C1"/>
@@ -5027,7 +5153,7 @@
       <w:r>
         <w:t xml:space="preserve">[6] Amazon Web Services, Manual deploys, AWS Amplify Hosting User Guide (accessed 21 October 2026). </w:t>
       </w:r>
-      <w:hyperlink r:id="rId19">
+      <w:hyperlink r:id="rId20">
         <w:r>
           <w:rPr>
             <w:color w:val="0563C1"/>
@@ -5045,7 +5171,7 @@
       <w:r>
         <w:t xml:space="preserve">[7] MDN Web Docs, MediaDevices getUserMedia method (accessed 21 October 2026). </w:t>
       </w:r>
-      <w:hyperlink r:id="rId20">
+      <w:hyperlink r:id="rId21">
         <w:r>
           <w:rPr>
             <w:color w:val="0563C1"/>
@@ -5814,9 +5940,6 @@
     <w:qFormat/>
     <w:rsid w:val="00FC693F"/>
     <w:pPr>
-      <w:pBdr>
-        <w:bottom w:val="single" w:sz="8" w:space="4" w:color="4F81BD" w:themeColor="accent1"/>
-      </w:pBdr>
       <w:spacing w:after="160" w:line="360" w:lineRule="auto"/>
       <w:contextualSpacing/>
     </w:pPr>

</xml_diff>

<commit_message>
Apply research-informed remote UI revision and update FYP materials
</commit_message>
<xml_diff>
--- a/docs/report-chapters-draft.docx
+++ b/docs/report-chapters-draft.docx
@@ -27,12 +27,13 @@
     </w:p>
     <w:p>
       <w:r>
-        <w:t>Revision date: 26 October 2026, incorporating a separate remote-study instrument and dated engineering verification. The submitted InfoNet abstract proposes a generic industrial data-collection interface. The image-and-metadata workflow is the implemented prototype scope; partner-specific requirements remain unconfirmed. Human evaluation results are not supplied for this report. Engineering evidence and its limitations are reported separately from the planned comparison.</w:t>
+        <w:t>Revision date: 26 October 2026, incorporating a separate remote-study instrument and dated engineering verification. The submitted InfoNet abstract proposes a generic industrial data-collection interface. The image-and-metadata workflow is the adopted working scope. Remote v3 is the primary planned comparison; partner-specific acceptance requirements remain unconfirmed. The 26 October revision also expands the literature review and design rationale. Human evaluation results are not supplied for this report. Engineering evidence and its limitations are reported separately from the planned comparison.</w:t>
       </w:r>
     </w:p>
     <w:p>
       <w:pPr>
         <w:pStyle w:val="Heading1"/>
+        <w:pageBreakBefore/>
       </w:pPr>
       <w:r>
         <w:t>Abstract</w:t>
@@ -40,7 +41,7 @@
     </w:p>
     <w:p>
       <w:r>
-        <w:t>This project develops a guided browser interface for collecting images with structured metadata. Session setup, import, validation, direct correction, transactional browser storage, recoverable drafts and ZIP export address failures identified during audit. The frozen desktop v2 build was deployed through AWS Amplify and verified in desktop Chrome on macOS and an isolated Ubuntu EC2 runner. Each platform passed 82 browser-regression checks and 42 hosting checks; the runner also passed 47 Node tests. Downloaded archives were independently checked for byte and metadata consistency. A folder-and-spreadsheet comparison was prepared for desktop v2. A separate remote v3 instrument compares the adapted guided workflow with a browser table and collects metadata through a private AWS backend. On 26 October, synthetic session S005 completed six records in each condition, both downloaded archives passed independent checks, and AWS confirmed submission. No image bytes were uploaded and both questionnaires were skipped. The walkthrough also identified a refresh-related task-reference defect. These results verify bounded software behaviour and do not supply human observations, SUS scores or interface-speed comparisons.</w:t>
+        <w:t>This project develops a guided browser interface for collecting images with structured metadata. The contribution combines validation, correction, review, recoverable storage and an independently checkable export. The primary planned evaluation is a paired remote v3 comparison between the guided interface and a basic browser table, using six prepared image-and-metadata tasks per condition. The frozen desktop v2 build and its earlier folder-and-spreadsheet protocol are retained as engineering history and an alternative demonstration. Published human studies support visible format rules, adjacent error feedback and structured entry, with mixed timing and satisfaction effects; none directly evaluates this prototype. These findings informed remote revision research-20261026-r1, which first displays validation errors on Save and preserves feedback while errors are corrected. Session and export identities distinguish this revision from legacy sessions. Automated checks cover validation, revision integrity, recovery and complete paired workflows; earlier hosted synthetic walkthroughs verified downloaded archives and acknowledged metadata submission. These are engineering results. No human participant observations are supplied, so completeness, accuracy, image association, completion time and perceived usability remain outcomes for the planned comparison.</w:t>
       </w:r>
     </w:p>
     <w:p>
@@ -95,7 +96,7 @@
     </w:p>
     <w:p>
       <w:r>
-        <w:t>The proposed research question is: for a defined images-and-metadata task, how does a guided collection interface compare with a basic folder-and-spreadsheet workflow in metadata completeness, metadata accuracy, successful image association and export, and task completion time? A secondary question concerns perceived usability and the difficulties encountered during recovery from errors. The desktop v2 comparison is deliberately local. Remote v3 adapts the question to a browser-table baseline, as stated separately in Section 3.5. Neither design claims that this prototype outperforms established data-collection platforms.</w:t>
+        <w:t>The primary research question is: for a defined images-and-metadata task, how does the guided remote v3 interface compare with a basic browser table in metadata completeness, metadata accuracy, format errors, image association, successful export and task completion time? Perceived usability and difficulties during correction or recovery provide further outcomes. Section 3.5 defines this paired comparison. The earlier desktop v2 folder-and-spreadsheet protocol is retained as a historical or alternative design, rather than the main planned study. Neither design tests superiority over established data-collection platforms.</w:t>
       </w:r>
     </w:p>
     <w:p>
@@ -141,7 +142,22 @@
     </w:p>
     <w:p>
       <w:r>
-        <w:t>Validation timing needs particular care. Guideline 16 recommends presenting errors together after the form has been completed and sent; its discussion reports that the earlier error-timing study found problems with feedback appearing when an erroneous field was left.[3] The present implementation validates on blur and then updates feedback during edits once the field has been touched, as well as validating on save. It is therefore not justified to cite that research as direct proof that the implemented blur behaviour is best. The design currently combines early correction opportunities with a final save gate, but this combination remains an empirical question. A later iteration could compare save-only and blur-plus-save feedback while holding the other workflow features constant.</w:t>
+        <w:t>Seckler and colleagues tested whether those guidelines change behaviour when applied together.[8] Sixty-five participants used three reconstructed real-world registration forms in a between-subject design, with 32 assigned to the original versions and 33 to versions improved according to the twenty guidelines. Mean completion time fell from 113 to 85 seconds for the Sueddeutsche form and from 105 to 70 seconds for the NZZ form, both significant differences. The Spiegel form fell from 104 to 85 seconds, but that time difference was not significant. All three improved forms required fewer submission trials, while satisfaction effects varied by form and questionnaire scale.[8] The study therefore supports treating the guidelines as a coherent package worth applying and testing. Because the changes were introduced as a bundle, it cannot show that one feature, such as required-field marking or error placement, caused the gains. Registration forms also differ from copying task labels and attaching the correct image.</w:t>
+      </w:r>
+    </w:p>
+    <w:p>
+      <w:r>
+        <w:t>Two narrower studies address feedback content and placement. In an experiment with 166 participants and four conditions for advance format guidance, giving format details before entry reduced errors and submission trials; an explicit rule was the most efficient presentation, and adding an example produced no further benefit.[9] This is relevant to the subject-identifier pattern, the field most exposed to format errors in the present schema. It supports a visible rule, but it does not show that the current added example is harmful. A study of 303 participants compared six error-message locations. Messages near the erroneous field produced better performance than messages at the top or bottom of the form, and the right-hand location was rated most satisfying and intuitive.[10] The prototype keeps error text beside the relevant input, which is consistent with the near-field result but is not a test of the right-hand layout. Only the abstracts of [9] and [10] were checked for this report, so no effect sizes are drawn from them. Location evidence also says nothing about when an error should first appear.</w:t>
+      </w:r>
+    </w:p>
+    <w:p>
+      <w:r>
+        <w:t>Validation timing needs particular care. Guideline 16 recommends presenting errors together after the form has been completed and sent; its discussion reports that the earlier error-timing study found problems with feedback appearing when an erroneous field was left.[3] That primary study reported two experiments, with 77 and 90 undergraduate participants, in which forms contained artificial format obstacles that were not disclosed in advance.[13] In the second study, the mean number of repeated errors was 3.48 when all errors were shown after submission, 3.17 when they were shown one at a time after submission, and 7.25 with feedback on blur. The overall difference was significant at p &lt; .03, whereas completion times did not differ significantly.[13] The result supports testing a less interruptive design in which first errors appear at an explicit save. It does not establish one optimal timing for every form. Its undisclosed obstacles differ from the present schema, where rules and required markers are visible before entry.</w:t>
+      </w:r>
+    </w:p>
+    <w:p>
+      <w:r>
+        <w:t>The frozen desktop v2 implementation validates on blur and then updates feedback during edits once the field has been touched, as well as validating on save. The original remote v3 guided condition reuses that behaviour. Neither the guideline chapter nor the timing study is direct proof that this blur behaviour is best or worst for the present task. The design combines early correction opportunities with a final save gate, but this combination remains an empirical question. A later iteration could compare save-only and blur-plus-save feedback while holding the other workflow features constant. Section 2.12 records the implemented, separately identified remote revision informed by this evidence; desktop v2 remains unchanged.</w:t>
       </w:r>
     </w:p>
     <w:p>
@@ -149,7 +165,30 @@
         <w:pStyle w:val="Heading2"/>
       </w:pPr>
       <w:r>
-        <w:t>1.5 Objectives and scope</w:t>
+        <w:t>1.5 Evidence from structured data-capture evaluations</w:t>
+      </w:r>
+    </w:p>
+    <w:p>
+      <w:r>
+        <w:t>Evaluations of electronic data capture provide indirect evidence about checked, structured entry. Zeleke and colleagues conducted a randomized crossover comparison in a health and demographic surveillance site, in which 12 interviewers collected 1246 questionnaires with each method. Paper and electronic records came from paired simultaneous interviews, with the order of tools randomized.[11] The overall item error rate was 1.67% on paper and 0.60% electronically, and the proportion of questionnaires containing at least one error was 41.89% and 30.89% respectively.[11] The electronic forms, built with ODK, used number, date and skip checks, allowed editing, and required only identifiers.[11] The result supports the general plausibility that collection-time checks reduce some data-entry errors. It cannot be assigned to one interface mechanism, its observations come from 12 interviewers rather than 1246 independent interface users, and its comparator was paper rather than a browser table. It therefore informs the hypotheses below without predicting the size of any difference in this project.</w:t>
+      </w:r>
+    </w:p>
+    <w:p>
+      <w:r>
+        <w:t>A recent randomized crossover study by Nakamura and colleagues compared two clinical registry data-entry interfaces with 20 therapists performing simulated registry tasks.[12] The tested wizard interface was associated with shorter completion times, fewer errors and lower NASA-TLX workload. Navigation and input methods also differed between the interfaces, and the authors explicitly caution against concluding that wizard designs are generally superior.[12] Only the early-access abstract was checked here, so no magnitude is reported. The study is useful as recent support for evaluating stepwise structured entry with paired task measures, not as proof for a guided image workflow.</w:t>
+      </w:r>
+    </w:p>
+    <w:p>
+      <w:r>
+        <w:t>Taken together, the external studies agree on a modest point: in their tested settings, visible rules, near-field feedback, collection-time checks and structured sequencing were associated with fewer errors or submission trials, while effects on time and satisfaction were less consistent. Their limits are equally consistent. Most tested bundles of changes, the participants and tasks differ from this project, and none evaluates the association between an image and its metadata. Hash matching and explicit image selection in this prototype are therefore engineering controls whose human benefit has not been studied by the cited work. These findings were obtained from external participants. They are distinct from this project's synthetic engineering observations, and they cannot substitute for the planned paired comparison.</w:t>
+      </w:r>
+    </w:p>
+    <w:p>
+      <w:pPr>
+        <w:pStyle w:val="Heading2"/>
+      </w:pPr>
+      <w:r>
+        <w:t>1.6 Objectives and scope</w:t>
       </w:r>
     </w:p>
     <w:p>
@@ -988,11 +1027,39 @@
     </w:p>
     <w:p>
       <w:pPr>
+        <w:pStyle w:val="Heading2"/>
+      </w:pPr>
+      <w:r>
+        <w:t>2.12 Literature-informed remote interface revision</w:t>
+      </w:r>
+    </w:p>
+    <w:p>
+      <w:r>
+        <w:t>The metadata-form choices draw on the evidence reviewed in Sections 1.4 and 1.5; Table 7 summarizes the mapping and its limits. Remote revision research-20261026-r1 first shows validation errors when the participant selects Save, then updates errors already displayed as the participant corrects them. A rejected save focuses the first invalid field. Required markers and format, length and choice guidance remain visible before entry. Field-adjacent messages, retained values, direct correction, draft recovery and review support the correction process. Categorical fields remain drop-downs; no radio-button change was introduced.</w:t>
+      </w:r>
+    </w:p>
+    <w:p>
+      <w:r>
+        <w:t>The protocol remains HLL04-remote-table-v3, with a separate immutable ui_revision recorded at session creation and carried through checkpoints, both condition manifests, receipts and researcher exports. Existing sessions without that field resolve to legacy-v3 and preserve the original blur behaviour. The backend rejects a revision switch within a session, and analysis selects one revision rather than pooling versions. Frozen desktop v2 remains unchanged. The selected task truth, schema, baseline controls, timers and SUS questions are retained. Task cards, prepared image choices and export support are shared by both remote conditions, so these shared features cannot explain a between-condition advantage.</w:t>
+      </w:r>
+    </w:p>
+    <w:p>
+      <w:r>
+        <w:t>Local and hosted engineering verification passed the checks described in Section 4.17. This revision is a literature-informed implementation choice, not a completed usability result. The planned Guided-versus-Table comparison evaluates the workflow as a whole and does not isolate validation timing as a separate experimental factor.</w:t>
+      </w:r>
+    </w:p>
+    <w:p>
+      <w:pPr>
         <w:pStyle w:val="Heading1"/>
         <w:pageBreakBefore/>
       </w:pPr>
       <w:r>
         <w:t>3 Methodology: planned evaluation</w:t>
+      </w:r>
+    </w:p>
+    <w:p>
+      <w:r>
+        <w:t>Remote v3 in Section 3.5 is the primary planned human comparison. Sections 3.1–3.4 retain the frozen desktop v2 protocol and scoring history so that earlier engineering evidence remains interpretable. Its sample target, baseline and timing endpoint must not be substituted for the remote protocol.</w:t>
       </w:r>
     </w:p>
     <w:p>
@@ -1112,12 +1179,17 @@
     </w:p>
     <w:p>
       <w:r>
-        <w:t>The remote protocol uses a plain in-browser table as its baseline. The original external folder-and-spreadsheet condition belongs to desktop v2. The exploratory target is six to eight permitted adult volunteers, without a power or official-minimum claim. Each person uses one desktop/laptop and browser for both conditions, while computers may differ between people. The same six cards, four required labels and explicit image choices are supplied to both conditions. Separate two-minute practices precede fresh measured blocks capped at fifteen minutes. Assigned order alternates, while reloads and interruptions remain recorded and timing does not silently pause.</w:t>
+        <w:t>The primary remote protocol uses a plain in-browser table as its baseline and identifies the selected interface revision in every session. The original external folder-and-spreadsheet condition belongs to desktop v2. The exploratory target is six to eight permitted adult volunteers, without a power or official-minimum claim. Each person uses one desktop/laptop and browser for both conditions, while computers may differ between people. The same six cards, four required labels and explicit image choices are supplied to both conditions. Separate two-minute practices precede fresh measured blocks capped at fifteen minutes. Assigned order alternates, while reloads and interruptions remain recorded and timing does not silently pause.</w:t>
       </w:r>
     </w:p>
     <w:p>
       <w:r>
         <w:t>Remote timing includes entry, review, correction, export generation and participant file checks; upload latency and questionnaire time are separate. Generated artifacts, requested downloads and participant-reported file opening are distinct observations. This endpoint differs from the researcher-verified desktop v2 endpoint. Completeness and accuracy retain all 24 required cells per condition, and selected-image hash agreement is reported out of six. Quality, completed timing and valid SUS each have separate eligibility and paired sample counts. Skipped questionnaires are missing, never zero. Synthetic tests and withdrawn sessions cannot enter human results, and no human observations are supplied as results in this report.</w:t>
+      </w:r>
+    </w:p>
+    <w:p>
+      <w:r>
+        <w:t>The literature motivates two directional predictions, not findings: guided entry is expected to produce fewer missing required metadata cells (H1) and fewer format violations (H2) than the table condition. Visible rules and collection-time checks offer the rationale [9][11]. All 24 assigned cells remain in the denominator, including unfinished tasks, so mandatory-field gating cannot manufacture success by excluding abandoned records. Factual accuracy and image association are separate exploratory outcomes: validation cannot identify every allowed but wrong value, and copying exact labels could create a ceiling effect. Completion time and SUS are also exploratory because correction and review add effort, while external timing and satisfaction findings vary [8][13]. With six to eight exploratory participants, the analysis will report participant-level paired differences and outcome-specific sample counts. Equal, reversed and inconclusive results will be retained.</w:t>
       </w:r>
     </w:p>
     <w:p>
@@ -4836,6 +4908,29 @@
     </w:p>
     <w:p>
       <w:pPr>
+        <w:pStyle w:val="Heading2"/>
+      </w:pPr>
+      <w:r>
+        <w:t>4.17 Literature-informed revision verification on 26 October</w:t>
+      </w:r>
+    </w:p>
+    <w:p>
+      <w:r>
+        <w:t>Revision research-20261026-r1 passed 38 backend/export tests, 22 analysis tests and 12 frontend-core tests. Browser checks passed 33 revision-specific assertions, 45 workflow assertions, 10 recovery scenarios, two slow-network scenarios and 18 six-record integration assertions. These counts describe overlapping software predicates, not independent experiments or participants. Checks covered initial Save-time errors and correction, legacy behaviour, reloads, revision identity in generated artifacts, and prevention of revision changes within a session. Independent review additionally checked exact retries after lost acknowledgements, preservation of newer local edits and rejection of tampered revisions without committing them. A scratch mutation that disabled the backend revision comparison was detected by the tests.</w:t>
+      </w:r>
+    </w:p>
+    <w:p>
+      <w:r>
+        <w:t>Initial local browser runs encountered failed asset requests. A concurrent static-file check reproduced connection resets in the loopback test server; increasing its accept backlog resolved the tested failure. The same workload then passed 27 of 27 requests, and an independent larger check passed 60 of 60. Fresh browser suites passed after this test-server repair. No production interface or participant timing was changed to mask the failure. Detailed revision and release evidence is indexed in docs/research-ui-change-notes.md. These checks establish the tested software behaviour and leave human outcomes unmeasured.</w:t>
+      </w:r>
+    </w:p>
+    <w:p>
+      <w:r>
+        <w:t>The backward-compatible backend update completed before the frontend release, preserving the existing API address, function identity and private configuration. Amplify job 6 succeeded at 17:31:33 HKT on 26 October. All 21 served files matched the release hashes; the five frozen desktop v2 files remained unchanged. Synthetic session S022 then completed both six-record conditions and passed 24 hosted assertions, including revision agreement across assignment, both ZIP manifests, submission, acknowledgement and private receipt. Independent inspection of both downloaded ZIPs verified six exact metadata records and six matching prepared images per condition, safe paths, CRC and CSV/manifest agreement. Questionnaire values in this automated run were fixtures and remain excluded from human analysis. No human participant records were read for this release.</w:t>
+      </w:r>
+    </w:p>
+    <w:p>
+      <w:pPr>
         <w:pStyle w:val="Heading1"/>
         <w:pageBreakBefore/>
       </w:pPr>
@@ -4886,9 +4981,598 @@
     </w:p>
     <w:p>
       <w:r>
-        <w:t>The comparison deliberately holds input images and devices constant. This improves control over transfer and acquisition effort, while narrowing the question to metadata entry, association, review and export. It cannot support a conclusion about taking photographs in the field. A later camera study would need controlled acquisition conditions, device testing, clear permission for the scene, and a way to distinguish image-quality problems from interface problems.</w:t>
+        <w:t>Both protocols hold the prepared input images constant. Desktop v2 fixes the laptop; remote v3 fixes the computer and browser within each participant while allowing differences between participants. This improves control over transfer and acquisition effort, while narrowing the question to metadata entry, association, review and export. It cannot support a conclusion about taking photographs in the field. A later camera study would need controlled acquisition conditions, device testing, clear permission for the scene, and a way to distinguish image-quality problems from interface problems.</w:t>
       </w:r>
     </w:p>
+    <w:p>
+      <w:r>
+        <w:t>Feedback timing involves a further trade-off. Blur-time feedback can expose a malformed identifier before the operator moves on, but the evidence in [13] suggests that early interruptions can increase repeated errors when rules are hidden. Save-time feedback defers that interruption and relies on visible rules and field-local messages to make correction straightforward. The present schema already discloses its rules, so the size of any difference here is uncertain. Retaining blur feedback in frozen desktop v2 and legacy remote sessions while implementing Save-time initial feedback in a separately identified remote revision keeps each observation attributable to one design, although no planned comparison isolates timing alone.</w:t>
+      </w:r>
+    </w:p>
+    <w:p>
+      <w:r>
+        <w:t>Table 7 relates the main metadata-form choices to the external evidence reviewed in Sections 1.4 and 1.5. The evidence column describes what the cited studies found in their own settings; it is not a measured result for this prototype.</w:t>
+      </w:r>
+    </w:p>
+    <w:p>
+      <w:pPr>
+        <w:pStyle w:val="Caption"/>
+        <w:keepNext/>
+        <w:spacing w:line="240" w:lineRule="auto" w:before="160" w:after="120"/>
+      </w:pPr>
+      <w:r>
+        <w:rPr>
+          <w:rFonts w:ascii="Times New Roman" w:hAnsi="Times New Roman"/>
+          <w:color w:val="000000"/>
+          <w:sz w:val="22"/>
+        </w:rPr>
+        <w:t>Table 7. Literature-informed rationale for metadata-form choices</w:t>
+      </w:r>
+    </w:p>
+    <w:tbl>
+      <w:tblPr>
+        <w:tblStyle w:val="TableGrid"/>
+        <w:tblW w:type="auto" w:w="0"/>
+        <w:jc w:val="center"/>
+        <w:tblLook w:firstColumn="1" w:firstRow="1" w:lastColumn="0" w:lastRow="0" w:noHBand="0" w:noVBand="1" w:val="04A0"/>
+        <w:tblBorders>
+          <w:top w:val="single" w:sz="4" w:color="D9D9D9"/>
+          <w:left w:val="single" w:sz="4" w:color="D9D9D9"/>
+          <w:bottom w:val="single" w:sz="4" w:color="D9D9D9"/>
+          <w:right w:val="single" w:sz="4" w:color="D9D9D9"/>
+          <w:insideH w:val="single" w:sz="4" w:color="D9D9D9"/>
+          <w:insideV w:val="single" w:sz="4" w:color="D9D9D9"/>
+        </w:tblBorders>
+      </w:tblPr>
+      <w:tblGrid>
+        <w:gridCol w:w="3009"/>
+        <w:gridCol w:w="3009"/>
+        <w:gridCol w:w="3009"/>
+      </w:tblGrid>
+      <w:tr>
+        <w:trPr>
+          <w:cantSplit/>
+          <w:tblHeader/>
+        </w:trPr>
+        <w:tc>
+          <w:tcPr>
+            <w:tcW w:type="dxa" w:w="3009"/>
+            <w:vAlign w:val="center"/>
+            <w:tcMar>
+              <w:top w:w="80" w:type="dxa"/>
+              <w:bottom w:w="80" w:type="dxa"/>
+              <w:left w:w="80" w:type="dxa"/>
+              <w:right w:w="80" w:type="dxa"/>
+            </w:tcMar>
+            <w:shd w:fill="E8EDF1"/>
+          </w:tcPr>
+          <w:p>
+            <w:pPr>
+              <w:spacing w:line="240" w:lineRule="auto" w:after="80"/>
+            </w:pPr>
+            <w:r>
+              <w:rPr>
+                <w:b/>
+                <w:sz w:val="20"/>
+              </w:rPr>
+              <w:t>Design choice</w:t>
+            </w:r>
+          </w:p>
+        </w:tc>
+        <w:tc>
+          <w:tcPr>
+            <w:tcW w:type="dxa" w:w="3009"/>
+            <w:vAlign w:val="center"/>
+            <w:tcMar>
+              <w:top w:w="80" w:type="dxa"/>
+              <w:bottom w:w="80" w:type="dxa"/>
+              <w:left w:w="80" w:type="dxa"/>
+              <w:right w:w="80" w:type="dxa"/>
+            </w:tcMar>
+            <w:shd w:fill="E8EDF1"/>
+          </w:tcPr>
+          <w:p>
+            <w:pPr>
+              <w:spacing w:line="240" w:lineRule="auto" w:after="80"/>
+            </w:pPr>
+            <w:r>
+              <w:rPr>
+                <w:b/>
+                <w:sz w:val="20"/>
+              </w:rPr>
+              <w:t>External evidence</w:t>
+            </w:r>
+          </w:p>
+        </w:tc>
+        <w:tc>
+          <w:tcPr>
+            <w:tcW w:type="dxa" w:w="3009"/>
+            <w:vAlign w:val="center"/>
+            <w:tcMar>
+              <w:top w:w="80" w:type="dxa"/>
+              <w:bottom w:w="80" w:type="dxa"/>
+              <w:left w:w="80" w:type="dxa"/>
+              <w:right w:w="80" w:type="dxa"/>
+            </w:tcMar>
+            <w:shd w:fill="E8EDF1"/>
+          </w:tcPr>
+          <w:p>
+            <w:pPr>
+              <w:spacing w:line="240" w:lineRule="auto" w:after="80"/>
+            </w:pPr>
+            <w:r>
+              <w:rPr>
+                <w:b/>
+                <w:sz w:val="20"/>
+              </w:rPr>
+              <w:t>Boundary for this project</w:t>
+            </w:r>
+          </w:p>
+        </w:tc>
+      </w:tr>
+      <w:tr>
+        <w:trPr>
+          <w:cantSplit/>
+        </w:trPr>
+        <w:tc>
+          <w:tcPr>
+            <w:tcW w:type="dxa" w:w="3009"/>
+            <w:vAlign w:val="center"/>
+            <w:tcMar>
+              <w:top w:w="80" w:type="dxa"/>
+              <w:bottom w:w="80" w:type="dxa"/>
+              <w:left w:w="80" w:type="dxa"/>
+              <w:right w:w="80" w:type="dxa"/>
+            </w:tcMar>
+          </w:tcPr>
+          <w:p>
+            <w:pPr>
+              <w:spacing w:line="240" w:lineRule="auto" w:after="80"/>
+            </w:pPr>
+            <w:r>
+              <w:rPr>
+                <w:b w:val="0"/>
+                <w:sz w:val="20"/>
+              </w:rPr>
+              <w:t>Visible required markers and explicit identifier rule</w:t>
+            </w:r>
+          </w:p>
+        </w:tc>
+        <w:tc>
+          <w:tcPr>
+            <w:tcW w:type="dxa" w:w="3009"/>
+            <w:vAlign w:val="center"/>
+            <w:tcMar>
+              <w:top w:w="80" w:type="dxa"/>
+              <w:bottom w:w="80" w:type="dxa"/>
+              <w:left w:w="80" w:type="dxa"/>
+              <w:right w:w="80" w:type="dxa"/>
+            </w:tcMar>
+          </w:tcPr>
+          <w:p>
+            <w:pPr>
+              <w:spacing w:line="240" w:lineRule="auto" w:after="80"/>
+            </w:pPr>
+            <w:r>
+              <w:rPr>
+                <w:b w:val="0"/>
+                <w:sz w:val="20"/>
+              </w:rPr>
+              <w:t>Guidelines recommend marking required fields and explaining formats [3]; advance explicit rules reduced errors and trials [9]</w:t>
+            </w:r>
+          </w:p>
+        </w:tc>
+        <w:tc>
+          <w:tcPr>
+            <w:tcW w:type="dxa" w:w="3009"/>
+            <w:vAlign w:val="center"/>
+            <w:tcMar>
+              <w:top w:w="80" w:type="dxa"/>
+              <w:bottom w:w="80" w:type="dxa"/>
+              <w:left w:w="80" w:type="dxa"/>
+              <w:right w:w="80" w:type="dxa"/>
+            </w:tcMar>
+          </w:tcPr>
+          <w:p>
+            <w:pPr>
+              <w:spacing w:line="240" w:lineRule="auto" w:after="80"/>
+            </w:pPr>
+            <w:r>
+              <w:rPr>
+                <w:b w:val="0"/>
+                <w:sz w:val="20"/>
+              </w:rPr>
+              <w:t>Identifier example retained in v2; its effect is untested</w:t>
+            </w:r>
+          </w:p>
+        </w:tc>
+      </w:tr>
+      <w:tr>
+        <w:trPr>
+          <w:cantSplit/>
+        </w:trPr>
+        <w:tc>
+          <w:tcPr>
+            <w:tcW w:type="dxa" w:w="3009"/>
+            <w:vAlign w:val="center"/>
+            <w:tcMar>
+              <w:top w:w="80" w:type="dxa"/>
+              <w:bottom w:w="80" w:type="dxa"/>
+              <w:left w:w="80" w:type="dxa"/>
+              <w:right w:w="80" w:type="dxa"/>
+            </w:tcMar>
+          </w:tcPr>
+          <w:p>
+            <w:pPr>
+              <w:spacing w:line="240" w:lineRule="auto" w:after="80"/>
+            </w:pPr>
+            <w:r>
+              <w:rPr>
+                <w:b w:val="0"/>
+                <w:sz w:val="20"/>
+              </w:rPr>
+              <w:t>Error text beside the affected field</w:t>
+            </w:r>
+          </w:p>
+        </w:tc>
+        <w:tc>
+          <w:tcPr>
+            <w:tcW w:type="dxa" w:w="3009"/>
+            <w:vAlign w:val="center"/>
+            <w:tcMar>
+              <w:top w:w="80" w:type="dxa"/>
+              <w:bottom w:w="80" w:type="dxa"/>
+              <w:left w:w="80" w:type="dxa"/>
+              <w:right w:w="80" w:type="dxa"/>
+            </w:tcMar>
+          </w:tcPr>
+          <w:p>
+            <w:pPr>
+              <w:spacing w:line="240" w:lineRule="auto" w:after="80"/>
+            </w:pPr>
+            <w:r>
+              <w:rPr>
+                <w:b w:val="0"/>
+                <w:sz w:val="20"/>
+              </w:rPr>
+              <w:t>Near-field messages outperformed top or bottom placement [10]</w:t>
+            </w:r>
+          </w:p>
+        </w:tc>
+        <w:tc>
+          <w:tcPr>
+            <w:tcW w:type="dxa" w:w="3009"/>
+            <w:vAlign w:val="center"/>
+            <w:tcMar>
+              <w:top w:w="80" w:type="dxa"/>
+              <w:bottom w:w="80" w:type="dxa"/>
+              <w:left w:w="80" w:type="dxa"/>
+              <w:right w:w="80" w:type="dxa"/>
+            </w:tcMar>
+          </w:tcPr>
+          <w:p>
+            <w:pPr>
+              <w:spacing w:line="240" w:lineRule="auto" w:after="80"/>
+            </w:pPr>
+            <w:r>
+              <w:rPr>
+                <w:b w:val="0"/>
+                <w:sz w:val="20"/>
+              </w:rPr>
+              <w:t>Location evidence; does not settle timing or right-hand layout</w:t>
+            </w:r>
+          </w:p>
+        </w:tc>
+      </w:tr>
+      <w:tr>
+        <w:trPr>
+          <w:cantSplit/>
+        </w:trPr>
+        <w:tc>
+          <w:tcPr>
+            <w:tcW w:type="dxa" w:w="3009"/>
+            <w:vAlign w:val="center"/>
+            <w:tcMar>
+              <w:top w:w="80" w:type="dxa"/>
+              <w:bottom w:w="80" w:type="dxa"/>
+              <w:left w:w="80" w:type="dxa"/>
+              <w:right w:w="80" w:type="dxa"/>
+            </w:tcMar>
+          </w:tcPr>
+          <w:p>
+            <w:pPr>
+              <w:spacing w:line="240" w:lineRule="auto" w:after="80"/>
+            </w:pPr>
+            <w:r>
+              <w:rPr>
+                <w:b w:val="0"/>
+                <w:sz w:val="20"/>
+              </w:rPr>
+              <w:t>Values retained after a rejected save; direct correction in review</w:t>
+            </w:r>
+          </w:p>
+        </w:tc>
+        <w:tc>
+          <w:tcPr>
+            <w:tcW w:type="dxa" w:w="3009"/>
+            <w:vAlign w:val="center"/>
+            <w:tcMar>
+              <w:top w:w="80" w:type="dxa"/>
+              <w:bottom w:w="80" w:type="dxa"/>
+              <w:left w:w="80" w:type="dxa"/>
+              <w:right w:w="80" w:type="dxa"/>
+            </w:tcMar>
+          </w:tcPr>
+          <w:p>
+            <w:pPr>
+              <w:spacing w:line="240" w:lineRule="auto" w:after="80"/>
+            </w:pPr>
+            <w:r>
+              <w:rPr>
+                <w:b w:val="0"/>
+                <w:sz w:val="20"/>
+              </w:rPr>
+              <w:t>Recommended practice [3]; editable checked forms formed part of the electronic condition in [11]</w:t>
+            </w:r>
+          </w:p>
+        </w:tc>
+        <w:tc>
+          <w:tcPr>
+            <w:tcW w:type="dxa" w:w="3009"/>
+            <w:vAlign w:val="center"/>
+            <w:tcMar>
+              <w:top w:w="80" w:type="dxa"/>
+              <w:bottom w:w="80" w:type="dxa"/>
+              <w:left w:w="80" w:type="dxa"/>
+              <w:right w:w="80" w:type="dxa"/>
+            </w:tcMar>
+          </w:tcPr>
+          <w:p>
+            <w:pPr>
+              <w:spacing w:line="240" w:lineRule="auto" w:after="80"/>
+            </w:pPr>
+            <w:r>
+              <w:rPr>
+                <w:b w:val="0"/>
+                <w:sz w:val="20"/>
+              </w:rPr>
+              <w:t>No isolated effect of editing is established</w:t>
+            </w:r>
+          </w:p>
+        </w:tc>
+      </w:tr>
+      <w:tr>
+        <w:trPr>
+          <w:cantSplit/>
+        </w:trPr>
+        <w:tc>
+          <w:tcPr>
+            <w:tcW w:type="dxa" w:w="3009"/>
+            <w:vAlign w:val="center"/>
+            <w:tcMar>
+              <w:top w:w="80" w:type="dxa"/>
+              <w:bottom w:w="80" w:type="dxa"/>
+              <w:left w:w="80" w:type="dxa"/>
+              <w:right w:w="80" w:type="dxa"/>
+            </w:tcMar>
+          </w:tcPr>
+          <w:p>
+            <w:pPr>
+              <w:spacing w:line="240" w:lineRule="auto" w:after="80"/>
+            </w:pPr>
+            <w:r>
+              <w:rPr>
+                <w:b w:val="0"/>
+                <w:sz w:val="20"/>
+              </w:rPr>
+              <w:t>First validation errors shown at save</w:t>
+            </w:r>
+          </w:p>
+        </w:tc>
+        <w:tc>
+          <w:tcPr>
+            <w:tcW w:type="dxa" w:w="3009"/>
+            <w:vAlign w:val="center"/>
+            <w:tcMar>
+              <w:top w:w="80" w:type="dxa"/>
+              <w:bottom w:w="80" w:type="dxa"/>
+              <w:left w:w="80" w:type="dxa"/>
+              <w:right w:w="80" w:type="dxa"/>
+            </w:tcMar>
+          </w:tcPr>
+          <w:p>
+            <w:pPr>
+              <w:spacing w:line="240" w:lineRule="auto" w:after="80"/>
+            </w:pPr>
+            <w:r>
+              <w:rPr>
+                <w:b w:val="0"/>
+                <w:sz w:val="20"/>
+              </w:rPr>
+              <w:t>Fewer repeated errors than on-blur feedback with undisclosed obstacles; no time difference [13]</w:t>
+            </w:r>
+          </w:p>
+        </w:tc>
+        <w:tc>
+          <w:tcPr>
+            <w:tcW w:type="dxa" w:w="3009"/>
+            <w:vAlign w:val="center"/>
+            <w:tcMar>
+              <w:top w:w="80" w:type="dxa"/>
+              <w:bottom w:w="80" w:type="dxa"/>
+              <w:left w:w="80" w:type="dxa"/>
+              <w:right w:w="80" w:type="dxa"/>
+            </w:tcMar>
+          </w:tcPr>
+          <w:p>
+            <w:pPr>
+              <w:spacing w:line="240" w:lineRule="auto" w:after="80"/>
+            </w:pPr>
+            <w:r>
+              <w:rPr>
+                <w:b w:val="0"/>
+                <w:sz w:val="20"/>
+              </w:rPr>
+              <w:t>Implemented in research-20261026-r1; desktop v2 and legacy v3 keep blur feedback</w:t>
+            </w:r>
+          </w:p>
+        </w:tc>
+      </w:tr>
+      <w:tr>
+        <w:trPr>
+          <w:cantSplit/>
+        </w:trPr>
+        <w:tc>
+          <w:tcPr>
+            <w:tcW w:type="dxa" w:w="3009"/>
+            <w:vAlign w:val="center"/>
+            <w:tcMar>
+              <w:top w:w="80" w:type="dxa"/>
+              <w:bottom w:w="80" w:type="dxa"/>
+              <w:left w:w="80" w:type="dxa"/>
+              <w:right w:w="80" w:type="dxa"/>
+            </w:tcMar>
+          </w:tcPr>
+          <w:p>
+            <w:pPr>
+              <w:spacing w:line="240" w:lineRule="auto" w:after="80"/>
+            </w:pPr>
+            <w:r>
+              <w:rPr>
+                <w:b w:val="0"/>
+                <w:sz w:val="20"/>
+              </w:rPr>
+              <w:t>Stepwise collection, review and export</w:t>
+            </w:r>
+          </w:p>
+        </w:tc>
+        <w:tc>
+          <w:tcPr>
+            <w:tcW w:type="dxa" w:w="3009"/>
+            <w:vAlign w:val="center"/>
+            <w:tcMar>
+              <w:top w:w="80" w:type="dxa"/>
+              <w:bottom w:w="80" w:type="dxa"/>
+              <w:left w:w="80" w:type="dxa"/>
+              <w:right w:w="80" w:type="dxa"/>
+            </w:tcMar>
+          </w:tcPr>
+          <w:p>
+            <w:pPr>
+              <w:spacing w:line="240" w:lineRule="auto" w:after="80"/>
+            </w:pPr>
+            <w:r>
+              <w:rPr>
+                <w:b w:val="0"/>
+                <w:sz w:val="20"/>
+              </w:rPr>
+              <w:t>Guideline bundle and wizard interface associated with fewer trials or errors [8][12]</w:t>
+            </w:r>
+          </w:p>
+        </w:tc>
+        <w:tc>
+          <w:tcPr>
+            <w:tcW w:type="dxa" w:w="3009"/>
+            <w:vAlign w:val="center"/>
+            <w:tcMar>
+              <w:top w:w="80" w:type="dxa"/>
+              <w:bottom w:w="80" w:type="dxa"/>
+              <w:left w:w="80" w:type="dxa"/>
+              <w:right w:w="80" w:type="dxa"/>
+            </w:tcMar>
+          </w:tcPr>
+          <w:p>
+            <w:pPr>
+              <w:spacing w:line="240" w:lineRule="auto" w:after="80"/>
+            </w:pPr>
+            <w:r>
+              <w:rPr>
+                <w:b w:val="0"/>
+                <w:sz w:val="20"/>
+              </w:rPr>
+              <w:t>Bundled differences; no general superiority claim</w:t>
+            </w:r>
+          </w:p>
+        </w:tc>
+      </w:tr>
+      <w:tr>
+        <w:trPr>
+          <w:cantSplit/>
+        </w:trPr>
+        <w:tc>
+          <w:tcPr>
+            <w:tcW w:type="dxa" w:w="3009"/>
+            <w:vAlign w:val="center"/>
+            <w:tcMar>
+              <w:top w:w="80" w:type="dxa"/>
+              <w:bottom w:w="80" w:type="dxa"/>
+              <w:left w:w="80" w:type="dxa"/>
+              <w:right w:w="80" w:type="dxa"/>
+            </w:tcMar>
+          </w:tcPr>
+          <w:p>
+            <w:pPr>
+              <w:spacing w:line="240" w:lineRule="auto" w:after="80"/>
+            </w:pPr>
+            <w:r>
+              <w:rPr>
+                <w:b w:val="0"/>
+                <w:sz w:val="20"/>
+              </w:rPr>
+              <w:t>Explicit image selection with hash checks</w:t>
+            </w:r>
+          </w:p>
+        </w:tc>
+        <w:tc>
+          <w:tcPr>
+            <w:tcW w:type="dxa" w:w="3009"/>
+            <w:vAlign w:val="center"/>
+            <w:tcMar>
+              <w:top w:w="80" w:type="dxa"/>
+              <w:bottom w:w="80" w:type="dxa"/>
+              <w:left w:w="80" w:type="dxa"/>
+              <w:right w:w="80" w:type="dxa"/>
+            </w:tcMar>
+          </w:tcPr>
+          <w:p>
+            <w:pPr>
+              <w:spacing w:line="240" w:lineRule="auto" w:after="80"/>
+            </w:pPr>
+            <w:r>
+              <w:rPr>
+                <w:b w:val="0"/>
+                <w:sz w:val="20"/>
+              </w:rPr>
+              <w:t>No cited study tests image-metadata association</w:t>
+            </w:r>
+          </w:p>
+        </w:tc>
+        <w:tc>
+          <w:tcPr>
+            <w:tcW w:type="dxa" w:w="3009"/>
+            <w:vAlign w:val="center"/>
+            <w:tcMar>
+              <w:top w:w="80" w:type="dxa"/>
+              <w:bottom w:w="80" w:type="dxa"/>
+              <w:left w:w="80" w:type="dxa"/>
+              <w:right w:w="80" w:type="dxa"/>
+            </w:tcMar>
+          </w:tcPr>
+          <w:p>
+            <w:pPr>
+              <w:spacing w:line="240" w:lineRule="auto" w:after="80"/>
+            </w:pPr>
+            <w:r>
+              <w:rPr>
+                <w:b w:val="0"/>
+                <w:sz w:val="20"/>
+              </w:rPr>
+              <w:t>Engineering control; human benefit unmeasured</w:t>
+            </w:r>
+          </w:p>
+        </w:tc>
+      </w:tr>
+    </w:tbl>
     <w:p>
       <w:pPr>
         <w:pStyle w:val="Heading2"/>
@@ -4898,6 +5582,9 @@
       </w:r>
     </w:p>
     <w:p>
+      <w:pPr>
+        <w:spacing w:before="120"/>
+      </w:pPr>
       <w:r>
         <w:t>The engineering tests were authored with assistance from AI systems that also assisted implementation. That shared involvement can leave blind spots. Separate code review, fault injection and independent archive parsing reduce some risks, but they do not constitute an independent industrial acceptance test. A passing assertion means that the tested predicate held for the supplied input and environment. It is not a proof that all possible sessions are recoverable.</w:t>
       </w:r>
@@ -5005,7 +5692,7 @@
     </w:p>
     <w:p>
       <w:r>
-        <w:t>This project develops a guided image-and-metadata collection workflow within the assigned topic of UI design for data collection. The contribution is a scoped implementation and a reproducible account of its validation, review, recovery and export behaviour. Established collection systems and form-design literature provide the background; required fields and structured capture are not claimed as novel inventions.</w:t>
+        <w:t>This project develops a guided image-and-metadata collection workflow within the assigned topic of UI design for data collection. The contribution is a scoped implementation and a reproducible account of its validation, review, recovery and export behaviour. Established collection systems and form-design literature provide the background; required fields and structured capture are not claimed as novel inventions. External studies associate explicit format rules, near-field feedback, save-time error presentation and checked structured entry with fewer errors or submission trials in their own settings. They motivate the design and hypotheses but do not show that this prototype improves human performance.</w:t>
       </w:r>
     </w:p>
     <w:p>
@@ -5020,7 +5707,7 @@
     </w:p>
     <w:p>
       <w:r>
-        <w:t>A separate remote v3 instrument adds a browser-table baseline and private metadata collection. Its 26 October synthetic Chrome run completed both six-record blocks, independently verified both downloaded packages and received a server-confirmed submission; both questionnaires were skipped. The subsequent repair was published as Amplify job 5 and checked through real hosted requests, downloaded archives and scoped recovery/fault cases. This demonstrates the tested engineering path and leaves human outcomes unavailable for this report. The remaining academic task is to connect the implemented workflow to observed use under a fair, versioned protocol and to confirm the intended industrial context. The final account should retain unsuccessful tasks and limitations, disclose AI assistance accurately, and state which design choices the student can explain and defend. These boundaries make the engineering contribution assessable while keeping uncollected results outside the conclusions.</w:t>
+        <w:t>Remote v3 is the primary planned comparison, with a browser-table baseline and private metadata collection. Its earlier 26 October synthetic Chrome run completed both six-record blocks, independently verified both downloaded packages and received a server-confirmed submission; both questionnaires were skipped. The subsequent repair was published as Amplify job 5 and checked through real hosted requests, downloaded archives and scoped recovery/fault cases. The later research-20261026-r1 revision adds Save-time initial feedback, explicit guidance and immutable revision tracking; its local and hosted checks passed as reported in Section 4.17. Together these results demonstrate the tested engineering path and leave human outcomes unavailable for this report. The remaining academic task is to connect the implemented workflow to observed use under a fair, versioned protocol and to confirm the intended industrial context. The final account should retain unsuccessful tasks and limitations, disclose AI assistance accurately, and state which design choices the student can explain and defend. These boundaries make the engineering contribution assessable while keeping uncollected results outside the conclusions.</w:t>
       </w:r>
     </w:p>
     <w:p>
@@ -5172,6 +5859,114 @@
         <w:t xml:space="preserve">[7] MDN Web Docs, MediaDevices getUserMedia method (accessed 21 October 2026). </w:t>
       </w:r>
       <w:hyperlink r:id="rId21">
+        <w:r>
+          <w:rPr>
+            <w:color w:val="0563C1"/>
+          </w:rPr>
+          <w:t>Source text</w:t>
+        </w:r>
+      </w:hyperlink>
+      <w:r/>
+    </w:p>
+    <w:p>
+      <w:pPr>
+        <w:keepLines/>
+        <w:spacing w:line="240" w:lineRule="auto" w:after="120"/>
+      </w:pPr>
+      <w:r>
+        <w:t xml:space="preserve">[8] M. Seckler, S. Heinz, J. A. Bargas-Avila, K. Opwis and A. N. Tuch, Designing usable web forms: empirical evaluation of web form improvement guidelines, Proceedings of CHI 2014, pp. 1275–1284. </w:t>
+      </w:r>
+      <w:hyperlink r:id="rId22">
+        <w:r>
+          <w:rPr>
+            <w:color w:val="0563C1"/>
+          </w:rPr>
+          <w:t>Source text</w:t>
+        </w:r>
+      </w:hyperlink>
+      <w:r/>
+    </w:p>
+    <w:p>
+      <w:pPr>
+        <w:keepLines/>
+        <w:spacing w:line="240" w:lineRule="auto" w:after="120"/>
+      </w:pPr>
+      <w:r>
+        <w:t xml:space="preserve">[9] J. A. Bargas-Avila, S. Orsini, H. Piosczyk, D. Urwyler and K. Opwis, Enhancing online forms: Use format specifications for fields with format restrictions to help respondents, Interacting with Computers, 23(1), 33–39, 2011. </w:t>
+      </w:r>
+      <w:hyperlink r:id="rId23">
+        <w:r>
+          <w:rPr>
+            <w:color w:val="0563C1"/>
+          </w:rPr>
+          <w:t>Source text</w:t>
+        </w:r>
+      </w:hyperlink>
+      <w:r/>
+    </w:p>
+    <w:p>
+      <w:pPr>
+        <w:keepLines/>
+        <w:spacing w:line="240" w:lineRule="auto" w:after="120"/>
+      </w:pPr>
+      <w:r>
+        <w:t xml:space="preserve">[10] M. Seckler, A. N. Tuch, K. Opwis and J. A. Bargas-Avila, User-friendly locations of error messages in web forms: Put them on the right side of the erroneous input field, Interacting with Computers, 24(3), 107–118, 2012. </w:t>
+      </w:r>
+      <w:hyperlink r:id="rId24">
+        <w:r>
+          <w:rPr>
+            <w:color w:val="0563C1"/>
+          </w:rPr>
+          <w:t>Source text</w:t>
+        </w:r>
+      </w:hyperlink>
+      <w:r/>
+    </w:p>
+    <w:p>
+      <w:pPr>
+        <w:keepLines/>
+        <w:spacing w:line="240" w:lineRule="auto" w:after="120"/>
+      </w:pPr>
+      <w:r>
+        <w:t xml:space="preserve">[11] A. A. Zeleke et al., Evaluation of Electronic and Paper-Pen Data Capturing Tools for Data Quality in a Public Health Survey in a Health and Demographic Surveillance Site, Ethiopia: Randomized Controlled Crossover Health Care Information Technology Evaluation, JMIR mHealth and uHealth, 7(2), e10995, 2019. </w:t>
+      </w:r>
+      <w:hyperlink r:id="rId25">
+        <w:r>
+          <w:rPr>
+            <w:color w:val="0563C1"/>
+          </w:rPr>
+          <w:t>Source text</w:t>
+        </w:r>
+      </w:hyperlink>
+      <w:r/>
+    </w:p>
+    <w:p>
+      <w:pPr>
+        <w:keepLines/>
+        <w:spacing w:line="240" w:lineRule="auto" w:after="120"/>
+      </w:pPr>
+      <w:r>
+        <w:t xml:space="preserve">[12] K. Nakamura, Y. Kasahara, G. Miura, A. Kinoshita and T. Asao, Usability of Two Clinical Registry Data-Entry Interfaces: A Randomized Crossover Study, Informatics, 13(10), 171, 2026. </w:t>
+      </w:r>
+      <w:hyperlink r:id="rId26">
+        <w:r>
+          <w:rPr>
+            <w:color w:val="0563C1"/>
+          </w:rPr>
+          <w:t>Source text</w:t>
+        </w:r>
+      </w:hyperlink>
+      <w:r/>
+    </w:p>
+    <w:p>
+      <w:pPr>
+        <w:keepLines/>
+        <w:spacing w:line="240" w:lineRule="auto" w:after="120"/>
+      </w:pPr>
+      <w:r>
+        <w:t xml:space="preserve">[13] J. A. Bargas-Avila, G. Oberholzer, P. Schmutz, M. de Vito and K. Opwis, Usable error message presentation in the World Wide Web: Do not show errors right away, Interacting with Computers, 19(3), 330–341, 2007. </w:t>
+      </w:r>
+      <w:hyperlink r:id="rId27">
         <w:r>
           <w:rPr>
             <w:color w:val="0563C1"/>

</xml_diff>